<commit_message>
Added new observer names from 2020 to 2026
</commit_message>
<xml_diff>
--- a/data-raw/metadata/Data Sheet Observer Names.docx
+++ b/data-raw/metadata/Data Sheet Observer Names.docx
@@ -1,6 +1,6 @@
 
 <file path=word/document.xml><?xml version="1.0" encoding="utf-8"?>
-<w:document xmlns:wpc="http://schemas.microsoft.com/office/word/2010/wordprocessingCanvas" xmlns:mc="http://schemas.openxmlformats.org/markup-compatibility/2006" xmlns:o="urn:schemas-microsoft-com:office:office" xmlns:r="http://schemas.openxmlformats.org/officeDocument/2006/relationships" xmlns:m="http://schemas.openxmlformats.org/officeDocument/2006/math" xmlns:v="urn:schemas-microsoft-com:vml" xmlns:wp14="http://schemas.microsoft.com/office/word/2010/wordprocessingDrawing" xmlns:wp="http://schemas.openxmlformats.org/drawingml/2006/wordprocessingDrawing" xmlns:w10="urn:schemas-microsoft-com:office:word" xmlns:w="http://schemas.openxmlformats.org/wordprocessingml/2006/main" xmlns:w14="http://schemas.microsoft.com/office/word/2010/wordml" xmlns:w15="http://schemas.microsoft.com/office/word/2012/wordml" xmlns:wpg="http://schemas.microsoft.com/office/word/2010/wordprocessingGroup" xmlns:wpi="http://schemas.microsoft.com/office/word/2010/wordprocessingInk" xmlns:wne="http://schemas.microsoft.com/office/word/2006/wordml" xmlns:wps="http://schemas.microsoft.com/office/word/2010/wordprocessingShape" mc:Ignorable="w14 w15 wp14">
+<w:document xmlns:wpc="http://schemas.microsoft.com/office/word/2010/wordprocessingCanvas" xmlns:cx="http://schemas.microsoft.com/office/drawing/2014/chartex" xmlns:cx1="http://schemas.microsoft.com/office/drawing/2015/9/8/chartex" xmlns:cx2="http://schemas.microsoft.com/office/drawing/2015/10/21/chartex" xmlns:cx3="http://schemas.microsoft.com/office/drawing/2016/5/9/chartex" xmlns:cx4="http://schemas.microsoft.com/office/drawing/2016/5/10/chartex" xmlns:cx5="http://schemas.microsoft.com/office/drawing/2016/5/11/chartex" xmlns:cx6="http://schemas.microsoft.com/office/drawing/2016/5/12/chartex" xmlns:cx7="http://schemas.microsoft.com/office/drawing/2016/5/13/chartex" xmlns:cx8="http://schemas.microsoft.com/office/drawing/2016/5/14/chartex" xmlns:mc="http://schemas.openxmlformats.org/markup-compatibility/2006" xmlns:aink="http://schemas.microsoft.com/office/drawing/2016/ink" xmlns:am3d="http://schemas.microsoft.com/office/drawing/2017/model3d" xmlns:o="urn:schemas-microsoft-com:office:office" xmlns:oel="http://schemas.microsoft.com/office/2019/extlst" xmlns:r="http://schemas.openxmlformats.org/officeDocument/2006/relationships" xmlns:m="http://schemas.openxmlformats.org/officeDocument/2006/math" xmlns:v="urn:schemas-microsoft-com:vml" xmlns:wp14="http://schemas.microsoft.com/office/word/2010/wordprocessingDrawing" xmlns:wp="http://schemas.openxmlformats.org/drawingml/2006/wordprocessingDrawing" xmlns:w10="urn:schemas-microsoft-com:office:word" xmlns:w="http://schemas.openxmlformats.org/wordprocessingml/2006/main" xmlns:w14="http://schemas.microsoft.com/office/word/2010/wordml" xmlns:w15="http://schemas.microsoft.com/office/word/2012/wordml" xmlns:w16cex="http://schemas.microsoft.com/office/word/2018/wordml/cex" xmlns:w16cid="http://schemas.microsoft.com/office/word/2016/wordml/cid" xmlns:w16="http://schemas.microsoft.com/office/word/2018/wordml" xmlns:w16du="http://schemas.microsoft.com/office/word/2023/wordml/word16du" xmlns:w16sdtdh="http://schemas.microsoft.com/office/word/2020/wordml/sdtdatahash" xmlns:w16sdtfl="http://schemas.microsoft.com/office/word/2024/wordml/sdtformatlock" xmlns:w16se="http://schemas.microsoft.com/office/word/2015/wordml/symex" xmlns:wpg="http://schemas.microsoft.com/office/word/2010/wordprocessingGroup" xmlns:wpi="http://schemas.microsoft.com/office/word/2010/wordprocessingInk" xmlns:wne="http://schemas.microsoft.com/office/word/2006/wordml" xmlns:wps="http://schemas.microsoft.com/office/word/2010/wordprocessingShape" mc:Ignorable="w14 w15 w16se w16cid w16 w16cex w16sdtdh w16sdtfl w16du wp14">
   <w:body>
     <w:p>
       <w:pPr>
@@ -26,6 +26,183 @@
       </w:pPr>
       <w:proofErr w:type="spellStart"/>
       <w:r>
+        <w:t>PaxtonS</w:t>
+      </w:r>
+      <w:proofErr w:type="spellEnd"/>
+    </w:p>
+    <w:p>
+      <w:pPr>
+        <w:contextualSpacing/>
+      </w:pPr>
+      <w:proofErr w:type="spellStart"/>
+      <w:r>
+        <w:t>SharonW</w:t>
+      </w:r>
+      <w:proofErr w:type="spellEnd"/>
+    </w:p>
+    <w:p>
+      <w:pPr>
+        <w:contextualSpacing/>
+      </w:pPr>
+    </w:p>
+    <w:p>
+      <w:pPr>
+        <w:contextualSpacing/>
+      </w:pPr>
+      <w:r>
+        <w:t>EmmaD</w:t>
+      </w:r>
+    </w:p>
+    <w:p>
+      <w:pPr>
+        <w:contextualSpacing/>
+      </w:pPr>
+      <w:proofErr w:type="spellStart"/>
+      <w:r>
+        <w:t>SaumyaB</w:t>
+      </w:r>
+      <w:proofErr w:type="spellEnd"/>
+    </w:p>
+    <w:p>
+      <w:pPr>
+        <w:contextualSpacing/>
+      </w:pPr>
+      <w:r>
+        <w:t>WillM</w:t>
+      </w:r>
+    </w:p>
+    <w:p>
+      <w:pPr>
+        <w:contextualSpacing/>
+      </w:pPr>
+    </w:p>
+    <w:p>
+      <w:pPr>
+        <w:contextualSpacing/>
+      </w:pPr>
+      <w:proofErr w:type="spellStart"/>
+      <w:r>
+        <w:t>MalloryF</w:t>
+      </w:r>
+      <w:proofErr w:type="spellEnd"/>
+    </w:p>
+    <w:p>
+      <w:pPr>
+        <w:contextualSpacing/>
+      </w:pPr>
+      <w:proofErr w:type="spellStart"/>
+      <w:r>
+        <w:t>MelanieK</w:t>
+      </w:r>
+      <w:proofErr w:type="spellEnd"/>
+    </w:p>
+    <w:p>
+      <w:pPr>
+        <w:contextualSpacing/>
+      </w:pPr>
+      <w:proofErr w:type="spellStart"/>
+      <w:r>
+        <w:t>RoryW</w:t>
+      </w:r>
+      <w:proofErr w:type="spellEnd"/>
+    </w:p>
+    <w:p>
+      <w:pPr>
+        <w:contextualSpacing/>
+      </w:pPr>
+    </w:p>
+    <w:p>
+      <w:pPr>
+        <w:contextualSpacing/>
+      </w:pPr>
+      <w:proofErr w:type="spellStart"/>
+      <w:r>
+        <w:t>DavidN</w:t>
+      </w:r>
+      <w:proofErr w:type="spellEnd"/>
+    </w:p>
+    <w:p>
+      <w:pPr>
+        <w:contextualSpacing/>
+      </w:pPr>
+      <w:proofErr w:type="spellStart"/>
+      <w:r>
+        <w:t>HannahW</w:t>
+      </w:r>
+      <w:proofErr w:type="spellEnd"/>
+    </w:p>
+    <w:p>
+      <w:pPr>
+        <w:contextualSpacing/>
+      </w:pPr>
+      <w:r>
+        <w:t>NicoleS</w:t>
+      </w:r>
+    </w:p>
+    <w:p>
+      <w:pPr>
+        <w:contextualSpacing/>
+      </w:pPr>
+      <w:r>
+        <w:t>WillD</w:t>
+      </w:r>
+    </w:p>
+    <w:p>
+      <w:pPr>
+        <w:contextualSpacing/>
+      </w:pPr>
+    </w:p>
+    <w:p>
+      <w:pPr>
+        <w:contextualSpacing/>
+      </w:pPr>
+      <w:proofErr w:type="spellStart"/>
+      <w:r>
+        <w:t>KarlyJ</w:t>
+      </w:r>
+      <w:proofErr w:type="spellEnd"/>
+    </w:p>
+    <w:p>
+      <w:pPr>
+        <w:contextualSpacing/>
+      </w:pPr>
+      <w:proofErr w:type="spellStart"/>
+      <w:r>
+        <w:t>BrooklynS</w:t>
+      </w:r>
+      <w:proofErr w:type="spellEnd"/>
+    </w:p>
+    <w:p>
+      <w:pPr>
+        <w:contextualSpacing/>
+      </w:pPr>
+      <w:proofErr w:type="spellStart"/>
+      <w:r>
+        <w:t>MorganU</w:t>
+      </w:r>
+      <w:proofErr w:type="spellEnd"/>
+    </w:p>
+    <w:p>
+      <w:pPr>
+        <w:contextualSpacing/>
+      </w:pPr>
+    </w:p>
+    <w:p>
+      <w:pPr>
+        <w:contextualSpacing/>
+      </w:pPr>
+      <w:proofErr w:type="spellStart"/>
+      <w:r>
+        <w:t>AlexM</w:t>
+      </w:r>
+      <w:proofErr w:type="spellEnd"/>
+    </w:p>
+    <w:p>
+      <w:pPr>
+        <w:contextualSpacing/>
+      </w:pPr>
+      <w:proofErr w:type="spellStart"/>
+      <w:r>
         <w:t>KelseyF</w:t>
       </w:r>
       <w:proofErr w:type="spellEnd"/>
@@ -44,11 +221,9 @@
       <w:pPr>
         <w:contextualSpacing/>
       </w:pPr>
-      <w:proofErr w:type="spellStart"/>
       <w:r>
         <w:t>SethA</w:t>
       </w:r>
-      <w:proofErr w:type="spellEnd"/>
     </w:p>
     <w:p>
       <w:pPr>
@@ -84,16 +259,6 @@
       <w:pPr>
         <w:contextualSpacing/>
       </w:pPr>
-      <w:proofErr w:type="spellStart"/>
-      <w:r>
-        <w:t>AlexM</w:t>
-      </w:r>
-      <w:proofErr w:type="spellEnd"/>
-    </w:p>
-    <w:p>
-      <w:pPr>
-        <w:contextualSpacing/>
-      </w:pPr>
     </w:p>
     <w:p>
       <w:pPr>
@@ -169,11 +334,9 @@
       <w:pPr>
         <w:contextualSpacing/>
       </w:pPr>
-      <w:proofErr w:type="spellStart"/>
       <w:r>
         <w:t>KaylaS</w:t>
       </w:r>
-      <w:proofErr w:type="spellEnd"/>
     </w:p>
     <w:p>
       <w:pPr>
@@ -209,11 +372,9 @@
       <w:pPr>
         <w:contextualSpacing/>
       </w:pPr>
-      <w:proofErr w:type="spellStart"/>
       <w:r>
         <w:t>SaharS</w:t>
       </w:r>
-      <w:proofErr w:type="spellEnd"/>
     </w:p>
     <w:p>
       <w:pPr>
@@ -222,8 +383,6 @@
       <w:r>
         <w:t>SammiS</w:t>
       </w:r>
-      <w:bookmarkStart w:id="0" w:name="_GoBack"/>
-      <w:bookmarkEnd w:id="0"/>
     </w:p>
     <w:p>
       <w:pPr>
@@ -242,11 +401,10 @@
       <w:pPr>
         <w:contextualSpacing/>
       </w:pPr>
-      <w:proofErr w:type="spellStart"/>
-      <w:r>
+      <w:r>
+        <w:lastRenderedPageBreak/>
         <w:t>AlecE</w:t>
       </w:r>
-      <w:proofErr w:type="spellEnd"/>
     </w:p>
     <w:p>
       <w:pPr>
@@ -282,11 +440,9 @@
       <w:pPr>
         <w:contextualSpacing/>
       </w:pPr>
-      <w:proofErr w:type="spellStart"/>
       <w:r>
         <w:t>RileyN</w:t>
       </w:r>
-      <w:proofErr w:type="spellEnd"/>
     </w:p>
     <w:p>
       <w:pPr>
@@ -412,23 +568,20 @@
       <w:pPr>
         <w:contextualSpacing/>
       </w:pPr>
-      <w:proofErr w:type="spellStart"/>
       <w:r>
         <w:t>SueB</w:t>
       </w:r>
-      <w:proofErr w:type="spellEnd"/>
-    </w:p>
-    <w:p>
-      <w:pPr>
-        <w:contextualSpacing/>
-      </w:pPr>
-    </w:p>
-    <w:p>
-      <w:pPr>
-        <w:contextualSpacing/>
-      </w:pPr>
-      <w:r>
-        <w:lastRenderedPageBreak/>
+    </w:p>
+    <w:p>
+      <w:pPr>
+        <w:contextualSpacing/>
+      </w:pPr>
+    </w:p>
+    <w:p>
+      <w:pPr>
+        <w:contextualSpacing/>
+      </w:pPr>
+      <w:r>
         <w:t>Unknown</w:t>
       </w:r>
     </w:p>
@@ -443,7 +596,7 @@
 </file>
 
 <file path=word/styles.xml><?xml version="1.0" encoding="utf-8"?>
-<w:styles xmlns:mc="http://schemas.openxmlformats.org/markup-compatibility/2006" xmlns:r="http://schemas.openxmlformats.org/officeDocument/2006/relationships" xmlns:w="http://schemas.openxmlformats.org/wordprocessingml/2006/main" xmlns:w14="http://schemas.microsoft.com/office/word/2010/wordml" xmlns:w15="http://schemas.microsoft.com/office/word/2012/wordml" mc:Ignorable="w14 w15">
+<w:styles xmlns:mc="http://schemas.openxmlformats.org/markup-compatibility/2006" xmlns:r="http://schemas.openxmlformats.org/officeDocument/2006/relationships" xmlns:w="http://schemas.openxmlformats.org/wordprocessingml/2006/main" xmlns:w14="http://schemas.microsoft.com/office/word/2010/wordml" xmlns:w15="http://schemas.microsoft.com/office/word/2012/wordml" xmlns:w16cex="http://schemas.microsoft.com/office/word/2018/wordml/cex" xmlns:w16cid="http://schemas.microsoft.com/office/word/2016/wordml/cid" xmlns:w16="http://schemas.microsoft.com/office/word/2018/wordml" xmlns:w16du="http://schemas.microsoft.com/office/word/2023/wordml/word16du" xmlns:w16sdtdh="http://schemas.microsoft.com/office/word/2020/wordml/sdtdatahash" xmlns:w16sdtfl="http://schemas.microsoft.com/office/word/2024/wordml/sdtformatlock" xmlns:w16se="http://schemas.microsoft.com/office/word/2015/wordml/symex" mc:Ignorable="w14 w15 w16se w16cid w16 w16cex w16sdtdh w16sdtfl w16du">
   <w:docDefaults>
     <w:rPrDefault>
       <w:rPr>
@@ -459,7 +612,7 @@
       </w:pPr>
     </w:pPrDefault>
   </w:docDefaults>
-  <w:latentStyles w:defLockedState="0" w:defUIPriority="99" w:defSemiHidden="0" w:defUnhideWhenUsed="0" w:defQFormat="0" w:count="371">
+  <w:latentStyles w:defLockedState="0" w:defUIPriority="99" w:defSemiHidden="0" w:defUnhideWhenUsed="0" w:defQFormat="0" w:count="376">
     <w:lsdException w:name="Normal" w:uiPriority="0" w:qFormat="1"/>
     <w:lsdException w:name="heading 1" w:uiPriority="9" w:qFormat="1"/>
     <w:lsdException w:name="heading 2" w:semiHidden="1" w:uiPriority="9" w:unhideWhenUsed="1" w:qFormat="1"/>
@@ -831,6 +984,11 @@
     <w:lsdException w:name="List Table 5 Dark Accent 6" w:uiPriority="50"/>
     <w:lsdException w:name="List Table 6 Colorful Accent 6" w:uiPriority="51"/>
     <w:lsdException w:name="List Table 7 Colorful Accent 6" w:uiPriority="52"/>
+    <w:lsdException w:name="Mention" w:semiHidden="1" w:unhideWhenUsed="1"/>
+    <w:lsdException w:name="Smart Hyperlink" w:semiHidden="1" w:unhideWhenUsed="1"/>
+    <w:lsdException w:name="Hashtag" w:semiHidden="1" w:unhideWhenUsed="1"/>
+    <w:lsdException w:name="Unresolved Mention" w:semiHidden="1" w:unhideWhenUsed="1"/>
+    <w:lsdException w:name="Smart Link" w:semiHidden="1" w:unhideWhenUsed="1"/>
   </w:latentStyles>
   <w:style w:type="paragraph" w:default="1" w:styleId="Normal">
     <w:name w:val="Normal"/>

</xml_diff>